<commit_message>
docs: MVP pitch notebook, fusion-principle brief update, LBNP request emails, lung-sounds spec
</commit_message>
<xml_diff>
--- a/EIA_Project_Brief.docx
+++ b/EIA_Project_Brief.docx
@@ -117,7 +117,7 @@
         <w:t xml:space="preserve">Diagnose and stabilize. </w:t>
       </w:r>
       <w:r>
-        <w:t>Output is what's wrong with the patient now, across every test the device runs, plus confirmation as the responder acts — verifying an airway with capnography, confirming a needle decompression re-expanded the lung, tracking whether hemorrhage control restores perfusion.</w:t>
+        <w:t>Output is what's wrong with the patient now, across every test the device runs, plus confirmation as the responder acts — verifying an airway with capnography, confirming a needle decompression re-expanded the lung, tracking whether hemorrhage control restores perfusion. The device runs entirely off its own sensors, with no manual data entry, and assumes the responder performs the physical exam (pulse, pupils, skin, mental status) rather than duplicating it. It surfaces individual instrumented findings the exam can't reach — an MI on the ECG, occult volume loss from the PPG — and declares a COMBINED diagnosis only when that diagnosis depends on fusing two or more instrumented signals no single sensor and no first-look exam could produce: chiefly shock etiology (cardiogenic vs. hemorrhagic vs. obstructive) and specific life-threats such as tension pneumothorax. That autonomous multi-signal synthesis at first contact — not any single test — is the device's diagnostic value; where a finding is obtainable by hand, the device defers to the responder rather than reproducing it.</w:t>
       </w:r>
     </w:p>
     <w:p>
@@ -369,7 +369,7 @@
         <w:jc w:val="both"/>
       </w:pPr>
       <w:r>
-        <w:t>Not the silicon (vendors sell it) or any single test (point solutions own each). The moat is the integration: an offline, milliwatt-scale core fusing many diagnostics, validated early-diagnosis signatures like PPG Compensatory Reserve that catch hemorrhage before vitals move, and an event-driven memory/compute design suited to a PIM background — wrapped in the MARCH stabilization loop.</w:t>
+        <w:t>Not the silicon (vendors sell it) or any single test (point solutions own each). The moat is the integration: an offline, milliwatt-scale core fusing many diagnostics, validated early-diagnosis signatures like PPG Compensatory Reserve that catch hemorrhage before vitals move, and an event-driven memory/compute design suited to a PIM background — wrapped in the MARCH stabilization loop. Sharpened: the defensible core is the autonomous fusion layer that turns several instrumented signals into the specific diagnoses — shock etiology, occult hemorrhage, tension pneumothorax — that neither a competitor's single-function device nor an unaided responder can produce at the point of injury. Individual tests are commodities; the multi-signal synthesis is not.</w:t>
       </w:r>
     </w:p>
     <w:p>

</xml_diff>

<commit_message>
docs: MVP pitch notebook (+investor figures), current-state brief, LBNP request emails, lung-sounds spec
</commit_message>
<xml_diff>
--- a/EIA_Project_Brief.docx
+++ b/EIA_Project_Brief.docx
@@ -53,7 +53,7 @@
         <w:t xml:space="preserve">Status (July 2026). </w:t>
       </w:r>
       <w:r>
-        <w:t>A pre-seed concept backed by a working software proof. The full neuromorphic deployment path — train a spiking model, quantize it to the chip's 8-bit arithmetic, and run it on a bit-exact hardware simulator — is validated end to end, so the hardware target is de-risked before any silicon is bought. One real clinical modality (ECG arrhythmia, MIT-BIH database) genuinely learns; a second (EEG seizure detection, CHB-MIT) is built and under evaluation. The codebase is version-controlled, unit-tested, and reproducible. Two near-term milestones frame the work: an investable pitch within a week and a demonstrable software MVP within a month (Section 12).</w:t>
+        <w:t>A pre-seed concept backed by a working software proof. Three real clinical modalities now both learn and deploy on the committed neuromorphic chip (BrainChip Akida) with almost no on-chip accuracy loss: ECG arrhythmia (MIT-BIH), heart-sound analysis (PhysioNet CinC 2016), and ECG myocardial-infarction detection (PTB-XL). The flagship occult-hemorrhage capability is demonstrated in physiologically-grounded simulation, with real induced-hypovolemia data requested. The codebase is version-controlled, unit-tested, and reproducible. Two near-term milestones frame the work: an investable pitch within a week and a demonstrable MVP within a month (Section 12).</w:t>
       </w:r>
     </w:p>
     <w:p>
@@ -502,7 +502,7 @@
         <w:t xml:space="preserve">What is proven. </w:t>
       </w:r>
       <w:r>
-        <w:t>The full Xylo deployment path works end to end in software: a trained spiking network maps, quantizes to 8-bit, and runs on SynSense's bit-precise XyloSim — which reproduces on-chip integer behaviour exactly — so the hardware target is verified before any chip is purchased. ECG (Circulation) genuinely learns on real data: on the MIT-BIH arrhythmia database the spiking classifier reaches 0.845 balanced accuracy discriminating normal vs. abnormal beats (per-class recall ~0.90 / ~0.79), the first modality validated on real clinical signals rather than synthetic. Engineering discipline is a deliberate asset — every result is labelled real vs. synthetic and guarded against silent substitution, data is split without leakage (by patient/case, not window), and results are reported multi-seed with per-class metrics — which already caught and corrected a masked majority-class collapse hiding behind a high headline number in the ECG model. These results are measured on the Xylo / XyloSim toolchain, the mature bit-exact vehicle for the neuromorphic-deployment method; the committed production architecture is the BrainChip Akida family (Section 4), and re-characterizing on MetaTF / Akida is a scoped roadmap step, not a rebuild.</w:t>
+        <w:t>The full deploy pipeline works end to end and is verified before any silicon is bought: a model is trained off-device, quantized to the chip's integer arithmetic, and run on BrainChip's Akida simulator. Three modalities learn on real clinical data and deploy on-chip with almost no accuracy loss — ECG arrhythmia (float AUROC 0.970, on-chip agreement 0.98), heart sounds (0.945, 0.95), and myocardial infarction (0.890, 0.92) — each a 5-seed measurement on a public dataset (MIT-BIH, CinC 2016, PTB-XL). Engineering discipline is deliberate: results labelled real vs. synthetic, leakage-safe splits (by patient/case), and multi-seed metrics with per-class recall — the rigor that has repeatedly caught masked failures.</w:t>
       </w:r>
     </w:p>
     <w:p>
@@ -516,7 +516,7 @@
         <w:t xml:space="preserve">What is in progress. </w:t>
       </w:r>
       <w:r>
-        <w:t>EEG (Head) is now a second real-data modality: the complete CHB-MIT seizure-detection pipeline — fixed clinical montage, band-pass, spike encoding, spiking classifier, bit-exact Xylo verification — is built and running. Current results are at chance, and rather than guess why, a purpose-built diagnostic is separating the two possible causes (too little cross-patient data vs. an over-lossy signal front-end); a larger evaluation is underway to decide which. The transferable asset is the method: a repeatable, honest way to stand up and evaluate a new modality. Hemorrhage (Massive) is blocked on data, not model — the flagship early-hemorrhage signal (PPG Compensatory Reserve) needs conscious-patient central-hypovolemia data; the best open, real, blood-loss-labelled set (VitalDB) was integrated and honestly found to carry no learnable signal at the granularity its label supports (anesthetized, whole-case estimate). Correctly time-resolved hemorrhage PPG is either access-gated (LBNP studies) or must be synthesized — a scoped data-access task, not a modelling dead end.</w:t>
+        <w:t>The flagship differentiated capability — occult hemorrhage from the PPG waveform (Compensatory Reserve) — is demonstrated end-to-end on a physiologically-grounded synthetic generator whose label is time-aligned to each moment's reserve, detecting compromise before heart rate moves (float AUROC 0.975). It is honestly synthetic: it proves the pipeline and that the signal is learnable, not clinical accuracy; real induced-hypovolemia (LBNP) data has been requested. The next component is the multi-signal fusion layer that combines several instrumented signals into diagnoses no single sensor or physical exam can produce (shock etiology, tension pneumothorax). Lung sounds (Respiration) are spec'd; an early EEG (Head) attempt was retired after coming back at chance.</w:t>
       </w:r>
     </w:p>
     <w:p>
@@ -527,10 +527,10 @@
         <w:rPr>
           <w:b/>
         </w:rPr>
-        <w:t xml:space="preserve">The engineering frontier — on-chip fidelity. </w:t>
+        <w:t xml:space="preserve">The engineering frontier — energy. </w:t>
       </w:r>
       <w:r>
-        <w:t>Quantizing to the chip's 8-bit arithmetic degrades accuracy, and the cause is diagnosed (per-timestep integer state-rounding compounding over the window, not weight precision). The design principle — keep windows short, treat sparsity vs. fidelity as a real trade-off — is understood; closing this gap on real ECG (currently ~0.56 float-vs-simulator agreement) is the top technical priority and the clearest near-term engineering milestone. Newly measured on the committed production target, this gap essentially closes: a quantized CNN on BrainChip Akida reproduces its float ECG accuracy almost exactly — float balanced accuracy 0.928 → Akida-simulator 0.926, agreement 0.98 over 5 seeds on real MIT-BIH — versus ~0.56 agreement for the LIF network on Xylo. Two honest caveats: the Akida path is a feed-forward quantized CNN, not the LIF spiking network, so it structurally avoids the temporal state-rounding that causes the Xylo gap (a chip-and-architecture result, not chip alone); and BrainChip publishes no bit-exactness claim for its simulator, so this is a strong software-simulator number, not a silicon guarantee, and the event-driven energy advantage remains to be re-measured on the CNN path. Still: on the silicon actually being shipped, the fidelity frontier that Xylo exposes is largely resolved for ECG.</w:t>
+        <w:t>The on-chip fidelity gap the earlier spiking path (Xylo) exposed is largely resolved on the committed Akida target: across all three real modalities the float model's accuracy survives quantization essentially intact (agreement 0.92–0.98), because a feed-forward quantized CNN avoids the temporal state-rounding that hurt the spiking net. The remaining open measurement is energy — the milliwatt claim rests on BrainChip's published always-on specs and an analytical model; a measured figure on the Akida-CNN path is the next validation.</w:t>
       </w:r>
     </w:p>
     <w:p>
@@ -541,10 +541,10 @@
         <w:rPr>
           <w:b/>
         </w:rPr>
-        <w:t xml:space="preserve">Architecture caveat. </w:t>
+        <w:t xml:space="preserve">Honest caveats. </w:t>
       </w:r>
       <w:r>
-        <w:t>One-chip co-residence of two modalities is structurally confirmed (independent per-neuron dynamics, block-placed weights, a valid config) but carries a real fidelity cost under Xylo's single shared 8-bit quantization scale; the multi-chip fallback (one Xylo per modality, fused on the Akida tier) stays open. No architecture conclusion is final until at least one modality is both non-degenerate and quantization-robust.</w:t>
+        <w:t>The on-chip numbers are from BrainChip's software simulator (no published bit-exact-to-silicon claim) and target Akida 2.0, not the sub-mW Akida Pico committed for the always-on cluster. The models are quantized CNNs, not spiking nets — a chip-and-architecture result, not chip alone. Hemorrhage/CRM is synthetic, not a clinical accuracy claim. And these are single-signal detectors; the multi-signal fusion layer is the next build.</w:t>
       </w:r>
     </w:p>
     <w:p>
@@ -560,7 +560,7 @@
         <w:pStyle w:val="ListBullet"/>
       </w:pPr>
       <w:r>
-        <w:t>Phase 0 — software proof (largely complete): the neuromorphic pipeline runs end-to-end on public clinical datasets; two real modalities wired; the accuracy-vs-energy trade-off traced; hardware target verified on the bit-exact simulator.</w:t>
+        <w:t>Phase 0 — software proof (done): the neuromorphic deploy pipeline is verified on the Akida simulator; three real-data modalities learn and deploy on the committed chip; the flagship hemorrhage capability is demonstrated in simulation.</w:t>
       </w:r>
     </w:p>
     <w:p>
@@ -568,7 +568,7 @@
         <w:pStyle w:val="ListBullet"/>
       </w:pPr>
       <w:r>
-        <w:t>Phase 1 — MVP hardening (now → ~1 month): close the ECG on-chip fidelity gap, land a solid second modality, and demonstrate concurrent multi-test detection with the milliwatt energy story as a repeatable demo.</w:t>
+        <w:t>Phase 1 — MVP hardening (now → ~1 month): the multi-signal fusion layer, a measured energy figure on the Akida path, and real induced-hypovolemia data plus a fourth modality (lung sounds).</w:t>
       </w:r>
     </w:p>
     <w:p>
@@ -611,7 +611,7 @@
         <w:t xml:space="preserve">Where we are. </w:t>
       </w:r>
       <w:r>
-        <w:t>A pre-seed concept with a working software proof — a validated neuromorphic deployment pipeline, one real clinical modality learning, a second in evaluation, and a clear, honest picture of what is proven and what is next. That is enough to raise on and enough to build a demonstrable MVP quickly, because the hard integration work — the offline SNN-to-simulator path — already exists.</w:t>
+        <w:t>A pre-seed concept with a working software proof — three real clinical modalities learning and deploying on the committed chip, the flagship hemorrhage capability demonstrated in simulation, and a clear, honest picture of what is proven and what is next. That is enough to raise on and enough to build a demonstrable MVP quickly, because the hard integration work already exists.</w:t>
       </w:r>
     </w:p>
     <w:p>

</xml_diff>

<commit_message>
docs: hardware BOM + v1 board design spec; brief sensor front-end table
</commit_message>
<xml_diff>
--- a/EIA_Project_Brief.docx
+++ b/EIA_Project_Brief.docx
@@ -264,6 +264,474 @@
       </w:r>
       <w:r>
         <w:t>The deployment pipeline — train a spiking model off-device with surrogate-gradient backpropagation, quantize it to the core's integer arithmetic, and verify it on a bit-exact simulator before any silicon is bought — is the transferable method, and it is chip-agnostic. It is demonstrated end-to-end today on SynSense's Rockpool / XyloSim toolchain because that bit-accurate simulator is mature and lets the whole system be verified in software now; porting the validated pipeline onto BrainChip's MetaTF / Akida flow is a scoped near-term step, not a rebuild, because the trained models are 1-D LIF networks that map to either target.</w:t>
+      </w:r>
+    </w:p>
+    <w:p>
+      <w:pPr>
+        <w:spacing w:before="160" w:after="60"/>
+      </w:pPr>
+      <w:r>
+        <w:rPr>
+          <w:b/>
+          <w:color w:val="2E5A88"/>
+          <w:sz w:val="22"/>
+        </w:rPr>
+        <w:t xml:space="preserve">Sensor front-ends (v1). </w:t>
+      </w:r>
+      <w:r>
+        <w:t>The working modalities reduce to three digital sensor front-ends; capnography adds a fourth.</w:t>
+      </w:r>
+    </w:p>
+    <w:tbl>
+      <w:tblPr>
+        <w:tblStyle w:val="TableGrid"/>
+        <w:tblW w:type="auto" w:w="0"/>
+        <w:tblLook w:firstColumn="1" w:firstRow="1" w:lastColumn="0" w:lastRow="0" w:noHBand="0" w:noVBand="1" w:val="04A0"/>
+      </w:tblPr>
+      <w:tblGrid>
+        <w:gridCol w:w="1728"/>
+        <w:gridCol w:w="1728"/>
+        <w:gridCol w:w="1728"/>
+        <w:gridCol w:w="1728"/>
+        <w:gridCol w:w="1728"/>
+      </w:tblGrid>
+      <w:tr>
+        <w:tc>
+          <w:tcPr>
+            <w:tcW w:type="dxa" w:w="1512"/>
+            <w:shd w:fill="2E5A88"/>
+          </w:tcPr>
+          <w:p>
+            <w:pPr>
+              <w:spacing w:after="20" w:before="20"/>
+            </w:pPr>
+            <w:r>
+              <w:rPr>
+                <w:b/>
+                <w:color w:val="FFFFFF"/>
+                <w:sz w:val="17"/>
+              </w:rPr>
+              <w:t>Front-end</w:t>
+            </w:r>
+          </w:p>
+        </w:tc>
+        <w:tc>
+          <w:tcPr>
+            <w:tcW w:type="dxa" w:w="2952"/>
+            <w:shd w:fill="2E5A88"/>
+          </w:tcPr>
+          <w:p>
+            <w:pPr>
+              <w:spacing w:after="20" w:before="20"/>
+            </w:pPr>
+            <w:r>
+              <w:rPr>
+                <w:b/>
+                <w:color w:val="FFFFFF"/>
+                <w:sz w:val="17"/>
+              </w:rPr>
+              <w:t>Serves</w:t>
+            </w:r>
+          </w:p>
+        </w:tc>
+        <w:tc>
+          <w:tcPr>
+            <w:tcW w:type="dxa" w:w="2952"/>
+            <w:shd w:fill="2E5A88"/>
+          </w:tcPr>
+          <w:p>
+            <w:pPr>
+              <w:spacing w:after="20" w:before="20"/>
+            </w:pPr>
+            <w:r>
+              <w:rPr>
+                <w:b/>
+                <w:color w:val="FFFFFF"/>
+                <w:sz w:val="17"/>
+              </w:rPr>
+              <w:t>Sensor</w:t>
+            </w:r>
+          </w:p>
+        </w:tc>
+        <w:tc>
+          <w:tcPr>
+            <w:tcW w:type="dxa" w:w="1080"/>
+            <w:shd w:fill="2E5A88"/>
+          </w:tcPr>
+          <w:p>
+            <w:pPr>
+              <w:spacing w:after="20" w:before="20"/>
+            </w:pPr>
+            <w:r>
+              <w:rPr>
+                <w:b/>
+                <w:color w:val="FFFFFF"/>
+                <w:sz w:val="17"/>
+              </w:rPr>
+              <w:t>Bus</w:t>
+            </w:r>
+          </w:p>
+        </w:tc>
+        <w:tc>
+          <w:tcPr>
+            <w:tcW w:type="dxa" w:w="1656"/>
+            <w:shd w:fill="2E5A88"/>
+          </w:tcPr>
+          <w:p>
+            <w:pPr>
+              <w:spacing w:after="20" w:before="20"/>
+            </w:pPr>
+            <w:r>
+              <w:rPr>
+                <w:b/>
+                <w:color w:val="FFFFFF"/>
+                <w:sz w:val="17"/>
+              </w:rPr>
+              <w:t>Power</w:t>
+            </w:r>
+          </w:p>
+        </w:tc>
+      </w:tr>
+      <w:tr>
+        <w:tc>
+          <w:tcPr>
+            <w:tcW w:type="dxa" w:w="1512"/>
+          </w:tcPr>
+          <w:p>
+            <w:pPr>
+              <w:spacing w:after="20" w:before="20"/>
+            </w:pPr>
+            <w:r>
+              <w:rPr>
+                <w:sz w:val="17"/>
+              </w:rPr>
+              <w:t>ECG</w:t>
+            </w:r>
+          </w:p>
+        </w:tc>
+        <w:tc>
+          <w:tcPr>
+            <w:tcW w:type="dxa" w:w="2952"/>
+          </w:tcPr>
+          <w:p>
+            <w:pPr>
+              <w:spacing w:after="20" w:before="20"/>
+            </w:pPr>
+            <w:r>
+              <w:rPr>
+                <w:sz w:val="17"/>
+              </w:rPr>
+              <w:t>arrhythmia · MI · shockable</w:t>
+            </w:r>
+          </w:p>
+        </w:tc>
+        <w:tc>
+          <w:tcPr>
+            <w:tcW w:type="dxa" w:w="2952"/>
+          </w:tcPr>
+          <w:p>
+            <w:pPr>
+              <w:spacing w:after="20" w:before="20"/>
+            </w:pPr>
+            <w:r>
+              <w:rPr>
+                <w:sz w:val="17"/>
+              </w:rPr>
+              <w:t>electrode + ECG AFE (12-lead)</w:t>
+            </w:r>
+          </w:p>
+        </w:tc>
+        <w:tc>
+          <w:tcPr>
+            <w:tcW w:type="dxa" w:w="1080"/>
+          </w:tcPr>
+          <w:p>
+            <w:pPr>
+              <w:spacing w:after="20" w:before="20"/>
+            </w:pPr>
+            <w:r>
+              <w:rPr>
+                <w:sz w:val="17"/>
+              </w:rPr>
+              <w:t>SPI</w:t>
+            </w:r>
+          </w:p>
+        </w:tc>
+        <w:tc>
+          <w:tcPr>
+            <w:tcW w:type="dxa" w:w="1656"/>
+          </w:tcPr>
+          <w:p>
+            <w:pPr>
+              <w:spacing w:after="20" w:before="20"/>
+            </w:pPr>
+            <w:r>
+              <w:rPr>
+                <w:sz w:val="17"/>
+              </w:rPr>
+              <w:t>always-on</w:t>
+            </w:r>
+          </w:p>
+        </w:tc>
+      </w:tr>
+      <w:tr>
+        <w:tc>
+          <w:tcPr>
+            <w:tcW w:type="dxa" w:w="1512"/>
+          </w:tcPr>
+          <w:p>
+            <w:pPr>
+              <w:spacing w:after="20" w:before="20"/>
+            </w:pPr>
+            <w:r>
+              <w:rPr>
+                <w:sz w:val="17"/>
+              </w:rPr>
+              <w:t>PPG</w:t>
+            </w:r>
+          </w:p>
+        </w:tc>
+        <w:tc>
+          <w:tcPr>
+            <w:tcW w:type="dxa" w:w="2952"/>
+          </w:tcPr>
+          <w:p>
+            <w:pPr>
+              <w:spacing w:after="20" w:before="20"/>
+            </w:pPr>
+            <w:r>
+              <w:rPr>
+                <w:sz w:val="17"/>
+              </w:rPr>
+              <w:t>occult hemorrhage (CRM) · SpO₂</w:t>
+            </w:r>
+          </w:p>
+        </w:tc>
+        <w:tc>
+          <w:tcPr>
+            <w:tcW w:type="dxa" w:w="2952"/>
+          </w:tcPr>
+          <w:p>
+            <w:pPr>
+              <w:spacing w:after="20" w:before="20"/>
+            </w:pPr>
+            <w:r>
+              <w:rPr>
+                <w:sz w:val="17"/>
+              </w:rPr>
+              <w:t>optical (red + IR)</w:t>
+            </w:r>
+          </w:p>
+        </w:tc>
+        <w:tc>
+          <w:tcPr>
+            <w:tcW w:type="dxa" w:w="1080"/>
+          </w:tcPr>
+          <w:p>
+            <w:pPr>
+              <w:spacing w:after="20" w:before="20"/>
+            </w:pPr>
+            <w:r>
+              <w:rPr>
+                <w:sz w:val="17"/>
+              </w:rPr>
+              <w:t>I²C/SPI</w:t>
+            </w:r>
+          </w:p>
+        </w:tc>
+        <w:tc>
+          <w:tcPr>
+            <w:tcW w:type="dxa" w:w="1656"/>
+          </w:tcPr>
+          <w:p>
+            <w:pPr>
+              <w:spacing w:after="20" w:before="20"/>
+            </w:pPr>
+            <w:r>
+              <w:rPr>
+                <w:sz w:val="17"/>
+              </w:rPr>
+              <w:t>always-on</w:t>
+            </w:r>
+          </w:p>
+        </w:tc>
+      </w:tr>
+      <w:tr>
+        <w:tc>
+          <w:tcPr>
+            <w:tcW w:type="dxa" w:w="1512"/>
+          </w:tcPr>
+          <w:p>
+            <w:pPr>
+              <w:spacing w:after="20" w:before="20"/>
+            </w:pPr>
+            <w:r>
+              <w:rPr>
+                <w:sz w:val="17"/>
+              </w:rPr>
+              <w:t>Heart sounds</w:t>
+            </w:r>
+          </w:p>
+        </w:tc>
+        <w:tc>
+          <w:tcPr>
+            <w:tcW w:type="dxa" w:w="2952"/>
+          </w:tcPr>
+          <w:p>
+            <w:pPr>
+              <w:spacing w:after="20" w:before="20"/>
+            </w:pPr>
+            <w:r>
+              <w:rPr>
+                <w:sz w:val="17"/>
+              </w:rPr>
+              <w:t>cardiac auscultation</w:t>
+            </w:r>
+          </w:p>
+        </w:tc>
+        <w:tc>
+          <w:tcPr>
+            <w:tcW w:type="dxa" w:w="2952"/>
+          </w:tcPr>
+          <w:p>
+            <w:pPr>
+              <w:spacing w:after="20" w:before="20"/>
+            </w:pPr>
+            <w:r>
+              <w:rPr>
+                <w:sz w:val="17"/>
+              </w:rPr>
+              <w:t>contact / MEMS mic</w:t>
+            </w:r>
+          </w:p>
+        </w:tc>
+        <w:tc>
+          <w:tcPr>
+            <w:tcW w:type="dxa" w:w="1080"/>
+          </w:tcPr>
+          <w:p>
+            <w:pPr>
+              <w:spacing w:after="20" w:before="20"/>
+            </w:pPr>
+            <w:r>
+              <w:rPr>
+                <w:sz w:val="17"/>
+              </w:rPr>
+              <w:t>I²S</w:t>
+            </w:r>
+          </w:p>
+        </w:tc>
+        <w:tc>
+          <w:tcPr>
+            <w:tcW w:type="dxa" w:w="1656"/>
+          </w:tcPr>
+          <w:p>
+            <w:pPr>
+              <w:spacing w:after="20" w:before="20"/>
+            </w:pPr>
+            <w:r>
+              <w:rPr>
+                <w:sz w:val="17"/>
+              </w:rPr>
+              <w:t>always-on</w:t>
+            </w:r>
+          </w:p>
+        </w:tc>
+      </w:tr>
+      <w:tr>
+        <w:tc>
+          <w:tcPr>
+            <w:tcW w:type="dxa" w:w="1512"/>
+          </w:tcPr>
+          <w:p>
+            <w:pPr>
+              <w:spacing w:after="20" w:before="20"/>
+            </w:pPr>
+            <w:r>
+              <w:rPr>
+                <w:sz w:val="17"/>
+              </w:rPr>
+              <w:t>Capnography</w:t>
+            </w:r>
+          </w:p>
+        </w:tc>
+        <w:tc>
+          <w:tcPr>
+            <w:tcW w:type="dxa" w:w="2952"/>
+          </w:tcPr>
+          <w:p>
+            <w:pPr>
+              <w:spacing w:after="20" w:before="20"/>
+            </w:pPr>
+            <w:r>
+              <w:rPr>
+                <w:sz w:val="17"/>
+              </w:rPr>
+              <w:t>airway</w:t>
+            </w:r>
+          </w:p>
+        </w:tc>
+        <w:tc>
+          <w:tcPr>
+            <w:tcW w:type="dxa" w:w="2952"/>
+          </w:tcPr>
+          <w:p>
+            <w:pPr>
+              <w:spacing w:after="20" w:before="20"/>
+            </w:pPr>
+            <w:r>
+              <w:rPr>
+                <w:sz w:val="17"/>
+              </w:rPr>
+              <w:t>NDIR CO₂ module + cannula + pump</w:t>
+            </w:r>
+          </w:p>
+        </w:tc>
+        <w:tc>
+          <w:tcPr>
+            <w:tcW w:type="dxa" w:w="1080"/>
+          </w:tcPr>
+          <w:p>
+            <w:pPr>
+              <w:spacing w:after="20" w:before="20"/>
+            </w:pPr>
+            <w:r>
+              <w:rPr>
+                <w:sz w:val="17"/>
+              </w:rPr>
+              <w:t>UART</w:t>
+            </w:r>
+          </w:p>
+        </w:tc>
+        <w:tc>
+          <w:tcPr>
+            <w:tcW w:type="dxa" w:w="1656"/>
+          </w:tcPr>
+          <w:p>
+            <w:pPr>
+              <w:spacing w:after="20" w:before="20"/>
+            </w:pPr>
+            <w:r>
+              <w:rPr>
+                <w:sz w:val="17"/>
+              </w:rPr>
+              <w:t>wake-on-demand</w:t>
+            </w:r>
+          </w:p>
+        </w:tc>
+      </w:tr>
+    </w:tbl>
+    <w:p>
+      <w:pPr>
+        <w:spacing w:before="60"/>
+      </w:pPr>
+      <w:r>
+        <w:rPr>
+          <w:i/>
+          <w:color w:val="5A5A5A"/>
+          <w:sz w:val="17"/>
+        </w:rPr>
+        <w:t>Akida is a digital core with no analog front-end: every sensor is digital-output and bridged to Akida by the host MCU, which also runs the signal preprocessing. A discrete-Akida board uses the AKD1000 (FCBGA package); the sub-milliwatt Akida Pico is licensable IP, not a solderable chip. See docs/hardware_bom.md.</w:t>
       </w:r>
     </w:p>
     <w:p>

</xml_diff>

<commit_message>
docs: current-stage brief + hardware bring-up plan; gitignore personal files
</commit_message>
<xml_diff>
--- a/EIA_Project_Brief.docx
+++ b/EIA_Project_Brief.docx
@@ -53,7 +53,21 @@
         <w:t xml:space="preserve">Status (July 2026). </w:t>
       </w:r>
       <w:r>
-        <w:t>A pre-seed concept backed by a working software proof. Three real clinical modalities now both learn and deploy on the committed neuromorphic chip (BrainChip Akida) with almost no on-chip accuracy loss: ECG arrhythmia (MIT-BIH), heart-sound analysis (PhysioNet CinC 2016), and ECG myocardial-infarction detection (PTB-XL). The flagship occult-hemorrhage capability is demonstrated in physiologically-grounded simulation, with real induced-hypovolemia data requested. The codebase is version-controlled, unit-tested, and reproducible. Two near-term milestones frame the work: an investable pitch within a week and a demonstrable MVP within a month (Section 12).</w:t>
+        <w:t>A pre-seed concept backed by a working software proof. Three real clinical modalities now both learn and deploy on the committed neuromorphic chip (BrainChip Akida) with almost no on-chip accuracy loss: ECG arrhythmia (MIT-BIH), heart-sound analysis (PhysioNet CinC 2016), and ECG myocardial-infarction detection (PTB-XL). The flagship occult-hemorrhage capability is demonstrated in physiologically-grounded simulation, with real induced-hypovolemia data requested. The codebase is version-controlled, unit-tested, and reproducible. Two near-term milestones frame the work: an investable pitch within a week and a demonstrable MVP within a month (Section 11).</w:t>
+      </w:r>
+    </w:p>
+    <w:p>
+      <w:pPr>
+        <w:spacing w:after="160"/>
+      </w:pPr>
+      <w:r>
+        <w:rPr>
+          <w:b/>
+        </w:rPr>
+        <w:t xml:space="preserve">Current stage. </w:t>
+      </w:r>
+      <w:r>
+        <w:t>Software and its deployment on the Akida simulator are validated across three real clinical modalities; the project is now at hardware bring-up. Akida is being evaluated on BrainChip's cloud FPGA — for the always-on power target and the sub-milliwatt Pico core — and a sensor-integrated prototype is being assembled on an off-the-shelf Akida board, with the sensor-acquisition and multi-signal-fusion software proceeding in parallel. No custom silicon or custom PCB is on the critical path.</w:t>
       </w:r>
     </w:p>
     <w:p>
@@ -222,20 +236,6 @@
       </w:r>
       <w:r>
         <w:t>Leaky integrate-and-fire (LIF) neurons in feed-forward layers: membrane potential integrates synaptic current, fires at threshold, resets by subtraction. Trained off-device with surrogate-gradient backpropagation, then deployed as fixed-weight inference — the standard neuromorphic pattern. No on-device training.</w:t>
-      </w:r>
-    </w:p>
-    <w:p>
-      <w:pPr>
-        <w:jc w:val="both"/>
-      </w:pPr>
-      <w:r>
-        <w:rPr>
-          <w:b/>
-        </w:rPr>
-        <w:t xml:space="preserve">On-chip fidelity — a design constraint we diagnosed. </w:t>
-      </w:r>
-      <w:r>
-        <w:t>Quantizing the trained model to the chip's 8-bit integer arithmetic degrades accuracy, and diagnosis localized the cause: it is not weight precision or decay approximation (both ruled out by ablation) but per-timestep integer state-rounding that compounds nonlinearly over the analysis window, because the spiking reset makes errors cascade rather than average out. The practical consequence is a platform design principle — on-chip fidelity scales with the number of timesteps, so windows should be kept short, and there is a real trade-off between very sparse firing (which we favor for energy) and quantization robustness. This is the current engineering frontier: keeping the deployed integer model faithful to the trained one across every modality.</w:t>
       </w:r>
     </w:p>
     <w:p>
@@ -911,52 +911,7 @@
           <w:color w:val="2E5A88"/>
           <w:sz w:val="26"/>
         </w:rPr>
-        <w:t>10. Risks</w:t>
-      </w:r>
-    </w:p>
-    <w:p>
-      <w:pPr>
-        <w:pStyle w:val="ListBullet"/>
-      </w:pPr>
-      <w:r>
-        <w:t>Field noise: motion, blast noise, and poor contact degrade CRM and acoustic tests — the MVP must stress-test this first.</w:t>
-      </w:r>
-    </w:p>
-    <w:p>
-      <w:pPr>
-        <w:pStyle w:val="ListBullet"/>
-      </w:pPr>
-      <w:r>
-        <w:t>Over-scope: building the full hub into v1 multiplies validation and stalls the program. Hold the on-core cluster.</w:t>
-      </w:r>
-    </w:p>
-    <w:p>
-      <w:pPr>
-        <w:pStyle w:val="ListBullet"/>
-      </w:pPr>
-      <w:r>
-        <w:t>Tooling: neuromorphic software lags CUDA/PyTorch; budget real time for spiking-model development.</w:t>
-      </w:r>
-    </w:p>
-    <w:p>
-      <w:pPr>
-        <w:pStyle w:val="ListBullet"/>
-      </w:pPr>
-      <w:r>
-        <w:t>Bundling: an ultrasound or lab incumbent could add offline modes; the moat must stay multi-modality integration.</w:t>
-      </w:r>
-    </w:p>
-    <w:p>
-      <w:pPr>
-        <w:spacing w:before="200" w:after="80"/>
-      </w:pPr>
-      <w:r>
-        <w:rPr>
-          <w:b/>
-          <w:color w:val="2E5A88"/>
-          <w:sz w:val="26"/>
-        </w:rPr>
-        <w:t>11. Where development stands</w:t>
+        <w:t>10. Where development stands</w:t>
       </w:r>
     </w:p>
     <w:p>
@@ -1065,7 +1020,7 @@
           <w:color w:val="2E5A88"/>
           <w:sz w:val="26"/>
         </w:rPr>
-        <w:t>12. Near-term plan: investable in a week, MVP in a month</w:t>
+        <w:t>11. Near-term plan: investable in a week, MVP in a month</w:t>
       </w:r>
     </w:p>
     <w:p>
@@ -1122,43 +1077,6 @@
       </w:r>
       <w:r>
         <w:t>Framed for the raise: fund the hardware step (FPGA plus Xylo/Akida development kits), a clinical-data access effort (gated induced-hypovolemia / LBNP hemorrhage data), and the engineering time to carry the MARCH on-core cluster from validated simulation to a field-testable prototype.</w:t>
-      </w:r>
-    </w:p>
-    <w:p>
-      <w:pPr>
-        <w:spacing w:before="200" w:after="80"/>
-      </w:pPr>
-      <w:r>
-        <w:rPr>
-          <w:b/>
-          <w:color w:val="2E5A88"/>
-          <w:sz w:val="26"/>
-        </w:rPr>
-        <w:t>13. Open questions</w:t>
-      </w:r>
-    </w:p>
-    <w:p>
-      <w:pPr>
-        <w:pStyle w:val="ListBullet"/>
-      </w:pPr>
-      <w:r>
-        <w:t>Which on-core tests hold accuracy under motion and noise — and which need a docked probe to be trustworthy?</w:t>
-      </w:r>
-    </w:p>
-    <w:p>
-      <w:pPr>
-        <w:pStyle w:val="ListBullet"/>
-      </w:pPr>
-      <w:r>
-        <w:t>What minimum test set would a disaster or military buyer actually deploy?</w:t>
-      </w:r>
-    </w:p>
-    <w:p>
-      <w:pPr>
-        <w:pStyle w:val="ListBullet"/>
-      </w:pPr>
-      <w:r>
-        <w:t>Full field unit vs. a licensable neuromorphic diagnostic core — which fits the team and funding?</w:t>
       </w:r>
     </w:p>
     <w:p>

</xml_diff>

<commit_message>
docs: reposition brief to intelligent patient monitor; add bring-up plan; gitignore personal files
</commit_message>
<xml_diff>
--- a/EIA_Project_Brief.docx
+++ b/EIA_Project_Brief.docx
@@ -12,7 +12,7 @@
           <w:color w:val="1F2A44"/>
           <w:sz w:val="44"/>
         </w:rPr>
-        <w:t>Neuromorphic Field Diagnostic Unit</w:t>
+        <w:t>Intelligent Patient Monitor</w:t>
       </w:r>
     </w:p>
     <w:p>
@@ -25,7 +25,7 @@
           <w:color w:val="5A5A5A"/>
           <w:sz w:val="22"/>
         </w:rPr>
-        <w:t>Disaster-zone diagnostic &amp; stabilization device — project brief · updated July 2026</w:t>
+        <w:t>Next-generation EMS monitoring — on-device AI, automatic documentation, and structured handoff · project brief</w:t>
       </w:r>
     </w:p>
     <w:p>
@@ -39,7 +39,7 @@
         <w:t xml:space="preserve">Concept. </w:t>
       </w:r>
       <w:r>
-        <w:t>A handheld, battery-powered diagnostic instrument built on a neuromorphic processor that runs and interprets multiple point-of-care tests at once, fully offline. On-device it performs hemorrhage detection (PPG Compensatory Reserve), ECG, heart- and lung-sound analysis, capnography, pulse oximetry, respiratory rate, and thermal/neuro assessment; ultrasound and blood-chemistry modules dock for imaging and labs. It gives a first responder at the point of injury a live read on the MARCH life threats — massive hemorrhage, airway, respiration, circulation, hypothermia — and confirms whether each stabilization step is working. It is a diagnostic-and-stabilization instrument, not a patient-triage or prioritization system; ICU use is a secondary market.</w:t>
+        <w:t>An intelligent patient monitor that replaces the one EMS crews already carry. Providers attach ECG leads, a blood-pressure cuff, and a pulse-oximeter exactly as they do today — the monitor fuses those signals, runs AI on the device (no cloud), automatically documents the encounter as a timestamped clinical timeline, and hands the receiving hospital a structured summary. Core monitoring (ECG, blood pressure, pulse oximetry, temperature) with optional modules (digital stethoscope, AI-guided ultrasound, thermal). It preserves the existing EMS workflow while making monitoring and handoff substantially more informative.</w:t>
       </w:r>
     </w:p>
     <w:p>
@@ -50,24 +50,10 @@
         <w:rPr>
           <w:b/>
         </w:rPr>
-        <w:t xml:space="preserve">Status (July 2026). </w:t>
+        <w:t xml:space="preserve">Status. </w:t>
       </w:r>
       <w:r>
-        <w:t>A pre-seed concept backed by a working software proof. Three real clinical modalities now both learn and deploy on the committed neuromorphic chip (BrainChip Akida) with almost no on-chip accuracy loss: ECG arrhythmia (MIT-BIH), heart-sound analysis (PhysioNet CinC 2016), and ECG myocardial-infarction detection (PTB-XL). The flagship occult-hemorrhage capability is demonstrated in physiologically-grounded simulation, with real induced-hypovolemia data requested. The codebase is version-controlled, unit-tested, and reproducible. Two near-term milestones frame the work: an investable pitch within a week and a demonstrable MVP within a month (Section 11).</w:t>
-      </w:r>
-    </w:p>
-    <w:p>
-      <w:pPr>
-        <w:spacing w:after="160"/>
-      </w:pPr>
-      <w:r>
-        <w:rPr>
-          <w:b/>
-        </w:rPr>
-        <w:t xml:space="preserve">Current stage. </w:t>
-      </w:r>
-      <w:r>
-        <w:t>Software and its deployment on the Akida simulator are validated across three real clinical modalities; the project is now at hardware bring-up. Akida is being evaluated on BrainChip's cloud FPGA — for the always-on power target and the sub-milliwatt Pico core — and a sensor-integrated prototype is being assembled on an off-the-shelf Akida board, with the sensor-acquisition and multi-signal-fusion software proceeding in parallel. No custom silicon or custom PCB is on the critical path.</w:t>
+        <w:t>A pre-seed concept with a working software proof. Three real clinical signal-interpretation models learn and deploy on the committed on-device AI chip (BrainChip Akida) with almost no on-chip accuracy loss — ECG arrhythmia (MIT-BIH), heart-sound analysis (CinC 2016), and ECG myocardial-infarction detection (PTB-XL); an occult-hemorrhage (compensatory-reserve) model is demonstrated in simulation. Now at hardware bring-up: Akida on BrainChip's cloud FPGA and a sensor-integrated prototype on an off-the-shelf Akida board, with sensor acquisition and the fusion/timeline software in parallel. No custom silicon or PCB is on the critical path.</w:t>
       </w:r>
     </w:p>
     <w:p>
@@ -80,7 +66,7 @@
           <w:color w:val="2E5A88"/>
           <w:sz w:val="26"/>
         </w:rPr>
-        <w:t>1. Problem</w:t>
+        <w:t>1. The real problem — it isn't sensors</w:t>
       </w:r>
     </w:p>
     <w:p>
@@ -88,15 +74,7 @@
         <w:jc w:val="both"/>
       </w:pPr>
       <w:r>
-        <w:t>Most disaster-zone deaths are preventable and come from a short list: hemorrhage (~91% of battlefield preventable deaths), airway obstruction (~7.9%), and tension pneumothorax (~1.1%). Nearly all are treatable in the field if caught in time.</w:t>
-      </w:r>
-    </w:p>
-    <w:p>
-      <w:pPr>
-        <w:jc w:val="both"/>
-      </w:pPr>
-      <w:r>
-        <w:t>The tools that catch them — ultrasound, cardiac and blood-gas analyzers, monitors — are separate boxes that assume mains power, trained interpretation, or a cloud link. A responder has minutes, a battery, no network, and no single device that looks for all the killers at once.</w:t>
+        <w:t>Sensors are not the gap. Nearly every modality EMS needs already exists as a portable device — ECG, pulse oximetry, blood pressure, temperature, digital stethoscope, capnography, ultrasound, thermal. The gap is what happens with the data: documentation is manual, patient handoff is fragmented, information is scattered across devices, and the clinical context — what changed, when, and how the patient responded to treatment — is lost or reconstructed from memory. Monitors record numbers; none capture the story.</w:t>
       </w:r>
     </w:p>
     <w:p>
@@ -109,7 +87,7 @@
           <w:color w:val="2E5A88"/>
           <w:sz w:val="26"/>
         </w:rPr>
-        <w:t>2. The device</w:t>
+        <w:t>2. What the product does</w:t>
       </w:r>
     </w:p>
     <w:p>
@@ -117,7 +95,7 @@
         <w:jc w:val="both"/>
       </w:pPr>
       <w:r>
-        <w:t>One portable unit: a neuromorphic core driving modular sensor front-ends, organized around MARCH (Massive hemorrhage, Airway, Respiration, Circulation, Hypothermia/Head) — the sequence responders already use. Neuromorphic hardware is the enabler because continuous multi-signal sensing on a battery with no cloud is exactly its event-driven, low-power sweet spot; it keeps the unit running across a whole scene instead of an hour.</w:t>
+        <w:t>It replaces the existing monitor with no change to workflow — leads, cuff, and pulse-ox go on exactly as before. The difference is what the monitor does with the signals: it fuses them on-device, detects clinically meaningful events and trends, documents automatically, and prepares the hospital handoff.</w:t>
       </w:r>
     </w:p>
     <w:p>
@@ -128,10 +106,94 @@
         <w:rPr>
           <w:b/>
         </w:rPr>
-        <w:t xml:space="preserve">Diagnose and stabilize. </w:t>
+        <w:t xml:space="preserve">The differentiator — an automatic clinical timeline. </w:t>
       </w:r>
       <w:r>
-        <w:t>Output is what's wrong with the patient now, across every test the device runs, plus confirmation as the responder acts — verifying an airway with capnography, confirming a needle decompression re-expanded the lung, tracking whether hemorrhage control restores perfusion. The device runs entirely off its own sensors, with no manual data entry, and assumes the responder performs the physical exam (pulse, pupils, skin, mental status) rather than duplicating it. It surfaces individual instrumented findings the exam can't reach — an MI on the ECG, occult volume loss from the PPG — and declares a COMBINED diagnosis only when that diagnosis depends on fusing two or more instrumented signals no single sensor and no first-look exam could produce: chiefly shock etiology (cardiogenic vs. hemorrhagic vs. obstructive) and specific life-threats such as tension pneumothorax. That autonomous multi-signal synthesis at first contact — not any single test — is the device's diagnostic value; where a finding is obtainable by hand, the device defers to the responder rather than reproducing it.</w:t>
+        <w:t>Instead of storing every measurement, the monitor records meaningful, trend-aware clinical events — far more useful to the receiving hospital than a table of vitals:</w:t>
+      </w:r>
+    </w:p>
+    <w:p>
+      <w:pPr>
+        <w:spacing w:after="0"/>
+        <w:ind w:left="432"/>
+      </w:pPr>
+      <w:r>
+        <w:rPr>
+          <w:rFonts w:ascii="Consolas" w:hAnsi="Consolas"/>
+          <w:color w:val="1F2A44"/>
+          <w:sz w:val="18"/>
+        </w:rPr>
+        <w:t>08:13  Baseline vitals established</w:t>
+      </w:r>
+    </w:p>
+    <w:p>
+      <w:pPr>
+        <w:spacing w:after="0"/>
+        <w:ind w:left="432"/>
+      </w:pPr>
+      <w:r>
+        <w:rPr>
+          <w:rFonts w:ascii="Consolas" w:hAnsi="Consolas"/>
+          <w:color w:val="1F2A44"/>
+          <w:sz w:val="18"/>
+        </w:rPr>
+        <w:t>08:19  BP decreased 23%  -&gt;  hypotension (94/58)</w:t>
+      </w:r>
+    </w:p>
+    <w:p>
+      <w:pPr>
+        <w:spacing w:after="0"/>
+        <w:ind w:left="432"/>
+      </w:pPr>
+      <w:r>
+        <w:rPr>
+          <w:rFonts w:ascii="Consolas" w:hAnsi="Consolas"/>
+          <w:color w:val="1F2A44"/>
+          <w:sz w:val="18"/>
+        </w:rPr>
+        <w:t>08:20  SpO2 desaturation (91%)</w:t>
+      </w:r>
+    </w:p>
+    <w:p>
+      <w:pPr>
+        <w:spacing w:after="0"/>
+        <w:ind w:left="432"/>
+      </w:pPr>
+      <w:r>
+        <w:rPr>
+          <w:rFonts w:ascii="Consolas" w:hAnsi="Consolas"/>
+          <w:color w:val="1F2A44"/>
+          <w:sz w:val="18"/>
+        </w:rPr>
+        <w:t>08:21  IV fluids started; HR +18 bpm</w:t>
+      </w:r>
+    </w:p>
+    <w:p>
+      <w:pPr>
+        <w:spacing w:after="0"/>
+        <w:ind w:left="432"/>
+      </w:pPr>
+      <w:r>
+        <w:rPr>
+          <w:rFonts w:ascii="Consolas" w:hAnsi="Consolas"/>
+          <w:color w:val="1F2A44"/>
+          <w:sz w:val="18"/>
+        </w:rPr>
+        <w:t>08:25  BP improving after treatment</w:t>
+      </w:r>
+    </w:p>
+    <w:p>
+      <w:pPr>
+        <w:spacing w:after="0"/>
+        <w:ind w:left="432"/>
+      </w:pPr>
+      <w:r>
+        <w:rPr>
+          <w:rFonts w:ascii="Consolas" w:hAnsi="Consolas"/>
+          <w:color w:val="1F2A44"/>
+          <w:sz w:val="18"/>
+        </w:rPr>
+        <w:t>08:33  Vitals stable for 10 min</w:t>
       </w:r>
     </w:p>
     <w:p>
@@ -142,10 +204,10 @@
         <w:rPr>
           <w:b/>
         </w:rPr>
-        <w:t xml:space="preserve">AI is the core, not an add-on. </w:t>
+        <w:t xml:space="preserve">Passive AI, clinician in control. </w:t>
       </w:r>
       <w:r>
-        <w:t>Every test is a machine-learning model interpreting a raw signal: reading ECG for arrhythmia or STEMI, classifying heart and lung sounds, extracting the Compensatory Reserve signature from PPG, detecting seizures in EEG, interpreting ultrasound features. These are trained offline and run as spiking neural networks on the neuromorphic chip — edge inference, fully offline, with no cloud and no on-device training. The novelty is not a new diagnostic algorithm but running many of them concurrently at a milliwatt budget where a GPU never could. It is decision support: the AI flags and confirms while the responder stays in control.</w:t>
+        <w:t>The AI does not declare diagnoses. It surfaces observations and trends — blood pressure decreasing, perfusion worsening, shock index rising — with a confidence score and a recommendation to reassess or repeat a measurement. It never states “the patient has hemorrhagic shock.” Clinicians keep the judgment; the monitor keeps the record.</w:t>
       </w:r>
     </w:p>
     <w:p>
@@ -158,7 +220,7 @@
           <w:color w:val="2E5A88"/>
           <w:sz w:val="26"/>
         </w:rPr>
-        <w:t>3. How many tests actually fit</w:t>
+        <w:t>3. Hardware — a core monitor plus modules</w:t>
       </w:r>
     </w:p>
     <w:p>
@@ -166,120 +228,7 @@
         <w:jc w:val="both"/>
       </w:pPr>
       <w:r>
-        <w:t>Tests split three ways by how they attach to the core. Most physiological diagnostics are pure compute and run on-core; ultrasound needs a docked probe; labs need a cartridge module. The unit spans all three; only the on-core class is native.</w:t>
-      </w:r>
-    </w:p>
-    <w:p>
-      <w:pPr>
-        <w:jc w:val="both"/>
-      </w:pPr>
-      <w:r>
-        <w:rPr>
-          <w:b/>
-        </w:rPr>
-        <w:t xml:space="preserve">Two hard walls. </w:t>
-      </w:r>
-      <w:r>
-        <w:t>A chip can't “do” ultrasound — a transducer physically generates the signal and the core only interprets it. Labs are reagent chemistry, not computation. Building the hub around these walls is what makes “many tests on one device” real.</w:t>
-      </w:r>
-    </w:p>
-    <w:p>
-      <w:pPr>
-        <w:spacing w:before="200" w:after="80"/>
-      </w:pPr>
-      <w:r>
-        <w:rPr>
-          <w:b/>
-          <w:color w:val="2E5A88"/>
-          <w:sz w:val="26"/>
-        </w:rPr>
-        <w:t>4. Technical design</w:t>
-      </w:r>
-    </w:p>
-    <w:p>
-      <w:pPr>
-        <w:jc w:val="both"/>
-      </w:pPr>
-      <w:r>
-        <w:rPr>
-          <w:b/>
-        </w:rPr>
-        <w:t xml:space="preserve">Signal path. </w:t>
-      </w:r>
-      <w:r>
-        <w:t>Each modality is captured as a continuous waveform, converted to sparse spike events, and classified by a spiking neural network (SNN) running on the neuromorphic core. Compute happens only when the signal changes, so energy scales with the number of events, not the sample rate.</w:t>
-      </w:r>
-    </w:p>
-    <w:p>
-      <w:pPr>
-        <w:jc w:val="both"/>
-      </w:pPr>
-      <w:r>
-        <w:rPr>
-          <w:b/>
-        </w:rPr>
-        <w:t xml:space="preserve">Encoding — delta / level-crossing. </w:t>
-      </w:r>
-      <w:r>
-        <w:t>A window is normalized (zero-mean, unit-variance), then delta-encoded: an ON event fires when the signal rises by a set threshold since the last event, an OFF event when it falls by that threshold, giving a two-channel ON/OFF spike raster. This is the same asynchronous scheme used by event cameras and neuromorphic ADCs. A higher threshold yields sparser events; combined with a training-time sparsity penalty, this is what earns the energy advantage — an SNN is only cheaper than a conventional network when it is sparse and uses few timesteps (operations scale with spike-rate × timesteps).</w:t>
-      </w:r>
-    </w:p>
-    <w:p>
-      <w:pPr>
-        <w:jc w:val="both"/>
-      </w:pPr>
-      <w:r>
-        <w:rPr>
-          <w:b/>
-        </w:rPr>
-        <w:t xml:space="preserve">Model. </w:t>
-      </w:r>
-      <w:r>
-        <w:t>Leaky integrate-and-fire (LIF) neurons in feed-forward layers: membrane potential integrates synaptic current, fires at threshold, resets by subtraction. Trained off-device with surrogate-gradient backpropagation, then deployed as fixed-weight inference — the standard neuromorphic pattern. No on-device training.</w:t>
-      </w:r>
-    </w:p>
-    <w:p>
-      <w:pPr>
-        <w:jc w:val="both"/>
-      </w:pPr>
-      <w:r>
-        <w:rPr>
-          <w:b/>
-        </w:rPr>
-        <w:t xml:space="preserve">Hardware target — one event-based neuromorphic family (BrainChip Akida). </w:t>
-      </w:r>
-      <w:r>
-        <w:t>The device commits to a single event-based neuromorphic family rather than two vendors. In v1 an ultra-low-power Akida-class core — BrainChip's Akida Pico runs in the sub-milliwatt range, purpose-built for always-on inference — carries the entire MARCH on-core biosignal cluster continuously. When the docked ultrasound and thermal-imaging modules are added, their 2-D convolution and heavy multimodal fusion run on a larger Akida in the same family, and Akida's on-chip edge learning (incremental last-layer adaptation) personalizes models to the patient and to field sensor conditions. One vendor, one toolchain (BrainChip MetaTF), one architecture scaling across every modality on the roadmap — chosen for capability-completeness and execution simplicity. An inference-only ultra-low-power part such as SynSense Xylo can undercut Akida on idle power for 1-D biosignals, but cannot do 2-D imaging, deep fusion, or any on-chip learning, so it would force a second architecture and toolchain the moment the roadmap moves past 1-D signals; Akida spans the whole roadmap.</w:t>
-      </w:r>
-    </w:p>
-    <w:p>
-      <w:pPr>
-        <w:jc w:val="both"/>
-      </w:pPr>
-      <w:r>
-        <w:rPr>
-          <w:b/>
-        </w:rPr>
-        <w:t xml:space="preserve">Development and validation. </w:t>
-      </w:r>
-      <w:r>
-        <w:t>The deployment pipeline — train a spiking model off-device with surrogate-gradient backpropagation, quantize it to the core's integer arithmetic, and verify it on a bit-exact simulator before any silicon is bought — is the transferable method, and it is chip-agnostic. It is demonstrated end-to-end today on SynSense's Rockpool / XyloSim toolchain because that bit-accurate simulator is mature and lets the whole system be verified in software now; porting the validated pipeline onto BrainChip's MetaTF / Akida flow is a scoped near-term step, not a rebuild, because the trained models are 1-D LIF networks that map to either target.</w:t>
-      </w:r>
-    </w:p>
-    <w:p>
-      <w:pPr>
-        <w:spacing w:before="160" w:after="60"/>
-      </w:pPr>
-      <w:r>
-        <w:rPr>
-          <w:b/>
-          <w:color w:val="2E5A88"/>
-          <w:sz w:val="22"/>
-        </w:rPr>
-        <w:t xml:space="preserve">Sensor front-ends (v1). </w:t>
-      </w:r>
-      <w:r>
-        <w:t>The working modalities reduce to three digital sensor front-ends; capnography adds a fourth.</w:t>
+        <w:t>Not an “everything device.” A core monitor covers what goes on nearly every patient; specialized capabilities are optional modules. This keeps cost, complexity, and regulatory burden down, and lets crews carry only what they need.</w:t>
       </w:r>
     </w:p>
     <w:tbl>
@@ -289,89 +238,11 @@
         <w:tblLook w:firstColumn="1" w:firstRow="1" w:lastColumn="0" w:lastRow="0" w:noHBand="0" w:noVBand="1" w:val="04A0"/>
       </w:tblPr>
       <w:tblGrid>
-        <w:gridCol w:w="1728"/>
-        <w:gridCol w:w="1728"/>
-        <w:gridCol w:w="1728"/>
-        <w:gridCol w:w="1728"/>
-        <w:gridCol w:w="1728"/>
+        <w:gridCol w:w="2880"/>
+        <w:gridCol w:w="2880"/>
+        <w:gridCol w:w="2880"/>
       </w:tblGrid>
       <w:tr>
-        <w:tc>
-          <w:tcPr>
-            <w:tcW w:type="dxa" w:w="1512"/>
-            <w:shd w:fill="2E5A88"/>
-          </w:tcPr>
-          <w:p>
-            <w:pPr>
-              <w:spacing w:after="20" w:before="20"/>
-            </w:pPr>
-            <w:r>
-              <w:rPr>
-                <w:b/>
-                <w:color w:val="FFFFFF"/>
-                <w:sz w:val="17"/>
-              </w:rPr>
-              <w:t>Front-end</w:t>
-            </w:r>
-          </w:p>
-        </w:tc>
-        <w:tc>
-          <w:tcPr>
-            <w:tcW w:type="dxa" w:w="2952"/>
-            <w:shd w:fill="2E5A88"/>
-          </w:tcPr>
-          <w:p>
-            <w:pPr>
-              <w:spacing w:after="20" w:before="20"/>
-            </w:pPr>
-            <w:r>
-              <w:rPr>
-                <w:b/>
-                <w:color w:val="FFFFFF"/>
-                <w:sz w:val="17"/>
-              </w:rPr>
-              <w:t>Serves</w:t>
-            </w:r>
-          </w:p>
-        </w:tc>
-        <w:tc>
-          <w:tcPr>
-            <w:tcW w:type="dxa" w:w="2952"/>
-            <w:shd w:fill="2E5A88"/>
-          </w:tcPr>
-          <w:p>
-            <w:pPr>
-              <w:spacing w:after="20" w:before="20"/>
-            </w:pPr>
-            <w:r>
-              <w:rPr>
-                <w:b/>
-                <w:color w:val="FFFFFF"/>
-                <w:sz w:val="17"/>
-              </w:rPr>
-              <w:t>Sensor</w:t>
-            </w:r>
-          </w:p>
-        </w:tc>
-        <w:tc>
-          <w:tcPr>
-            <w:tcW w:type="dxa" w:w="1080"/>
-            <w:shd w:fill="2E5A88"/>
-          </w:tcPr>
-          <w:p>
-            <w:pPr>
-              <w:spacing w:after="20" w:before="20"/>
-            </w:pPr>
-            <w:r>
-              <w:rPr>
-                <w:b/>
-                <w:color w:val="FFFFFF"/>
-                <w:sz w:val="17"/>
-              </w:rPr>
-              <w:t>Bus</w:t>
-            </w:r>
-          </w:p>
-        </w:tc>
         <w:tc>
           <w:tcPr>
             <w:tcW w:type="dxa" w:w="1656"/>
@@ -387,15 +258,14 @@
                 <w:color w:val="FFFFFF"/>
                 <w:sz w:val="17"/>
               </w:rPr>
-              <w:t>Power</w:t>
+              <w:t>Tier</w:t>
             </w:r>
           </w:p>
         </w:tc>
-      </w:tr>
-      <w:tr>
         <w:tc>
           <w:tcPr>
-            <w:tcW w:type="dxa" w:w="1512"/>
+            <w:tcW w:type="dxa" w:w="4320"/>
+            <w:shd w:fill="2E5A88"/>
           </w:tcPr>
           <w:p>
             <w:pPr>
@@ -403,15 +273,18 @@
             </w:pPr>
             <w:r>
               <w:rPr>
+                <w:b/>
+                <w:color w:val="FFFFFF"/>
                 <w:sz w:val="17"/>
               </w:rPr>
-              <w:t>ECG</w:t>
+              <w:t>Capability</w:t>
             </w:r>
           </w:p>
         </w:tc>
         <w:tc>
           <w:tcPr>
-            <w:tcW w:type="dxa" w:w="2952"/>
+            <w:tcW w:type="dxa" w:w="3744"/>
+            <w:shd w:fill="2E5A88"/>
           </w:tcPr>
           <w:p>
             <w:pPr>
@@ -419,44 +292,16 @@
             </w:pPr>
             <w:r>
               <w:rPr>
+                <w:b/>
+                <w:color w:val="FFFFFF"/>
                 <w:sz w:val="17"/>
               </w:rPr>
-              <w:t>arrhythmia · MI · shockable</w:t>
+              <w:t>Role</w:t>
             </w:r>
           </w:p>
         </w:tc>
-        <w:tc>
-          <w:tcPr>
-            <w:tcW w:type="dxa" w:w="2952"/>
-          </w:tcPr>
-          <w:p>
-            <w:pPr>
-              <w:spacing w:after="20" w:before="20"/>
-            </w:pPr>
-            <w:r>
-              <w:rPr>
-                <w:sz w:val="17"/>
-              </w:rPr>
-              <w:t>electrode + ECG AFE (12-lead)</w:t>
-            </w:r>
-          </w:p>
-        </w:tc>
-        <w:tc>
-          <w:tcPr>
-            <w:tcW w:type="dxa" w:w="1080"/>
-          </w:tcPr>
-          <w:p>
-            <w:pPr>
-              <w:spacing w:after="20" w:before="20"/>
-            </w:pPr>
-            <w:r>
-              <w:rPr>
-                <w:sz w:val="17"/>
-              </w:rPr>
-              <w:t>SPI</w:t>
-            </w:r>
-          </w:p>
-        </w:tc>
+      </w:tr>
+      <w:tr>
         <w:tc>
           <w:tcPr>
             <w:tcW w:type="dxa" w:w="1656"/>
@@ -469,15 +314,13 @@
               <w:rPr>
                 <w:sz w:val="17"/>
               </w:rPr>
-              <w:t>always-on</w:t>
+              <w:t>Core monitor</w:t>
             </w:r>
           </w:p>
         </w:tc>
-      </w:tr>
-      <w:tr>
         <w:tc>
           <w:tcPr>
-            <w:tcW w:type="dxa" w:w="1512"/>
+            <w:tcW w:type="dxa" w:w="4320"/>
           </w:tcPr>
           <w:p>
             <w:pPr>
@@ -487,13 +330,13 @@
               <w:rPr>
                 <w:sz w:val="17"/>
               </w:rPr>
-              <w:t>PPG</w:t>
+              <w:t>ECG · blood pressure · pulse oximetry (PPG) · temperature</w:t>
             </w:r>
           </w:p>
         </w:tc>
         <w:tc>
           <w:tcPr>
-            <w:tcW w:type="dxa" w:w="2952"/>
+            <w:tcW w:type="dxa" w:w="3744"/>
           </w:tcPr>
           <w:p>
             <w:pPr>
@@ -503,42 +346,12 @@
               <w:rPr>
                 <w:sz w:val="17"/>
               </w:rPr>
-              <w:t>occult hemorrhage (CRM) · SpO₂</w:t>
+              <w:t>on nearly every patient — the platform</w:t>
             </w:r>
           </w:p>
         </w:tc>
-        <w:tc>
-          <w:tcPr>
-            <w:tcW w:type="dxa" w:w="2952"/>
-          </w:tcPr>
-          <w:p>
-            <w:pPr>
-              <w:spacing w:after="20" w:before="20"/>
-            </w:pPr>
-            <w:r>
-              <w:rPr>
-                <w:sz w:val="17"/>
-              </w:rPr>
-              <w:t>optical (red + IR)</w:t>
-            </w:r>
-          </w:p>
-        </w:tc>
-        <w:tc>
-          <w:tcPr>
-            <w:tcW w:type="dxa" w:w="1080"/>
-          </w:tcPr>
-          <w:p>
-            <w:pPr>
-              <w:spacing w:after="20" w:before="20"/>
-            </w:pPr>
-            <w:r>
-              <w:rPr>
-                <w:sz w:val="17"/>
-              </w:rPr>
-              <w:t>I²C/SPI</w:t>
-            </w:r>
-          </w:p>
-        </w:tc>
+      </w:tr>
+      <w:tr>
         <w:tc>
           <w:tcPr>
             <w:tcW w:type="dxa" w:w="1656"/>
@@ -551,15 +364,13 @@
               <w:rPr>
                 <w:sz w:val="17"/>
               </w:rPr>
-              <w:t>always-on</w:t>
+              <w:t>Optional module</w:t>
             </w:r>
           </w:p>
         </w:tc>
-      </w:tr>
-      <w:tr>
         <w:tc>
           <w:tcPr>
-            <w:tcW w:type="dxa" w:w="1512"/>
+            <w:tcW w:type="dxa" w:w="4320"/>
           </w:tcPr>
           <w:p>
             <w:pPr>
@@ -569,13 +380,13 @@
               <w:rPr>
                 <w:sz w:val="17"/>
               </w:rPr>
-              <w:t>Heart sounds</w:t>
+              <w:t>Digital stethoscope (heart/lung sounds)</w:t>
             </w:r>
           </w:p>
         </w:tc>
         <w:tc>
           <w:tcPr>
-            <w:tcW w:type="dxa" w:w="2952"/>
+            <w:tcW w:type="dxa" w:w="3744"/>
           </w:tcPr>
           <w:p>
             <w:pPr>
@@ -585,42 +396,12 @@
               <w:rPr>
                 <w:sz w:val="17"/>
               </w:rPr>
-              <w:t>cardiac auscultation</w:t>
+              <w:t>added when auscultation is needed</w:t>
             </w:r>
           </w:p>
         </w:tc>
-        <w:tc>
-          <w:tcPr>
-            <w:tcW w:type="dxa" w:w="2952"/>
-          </w:tcPr>
-          <w:p>
-            <w:pPr>
-              <w:spacing w:after="20" w:before="20"/>
-            </w:pPr>
-            <w:r>
-              <w:rPr>
-                <w:sz w:val="17"/>
-              </w:rPr>
-              <w:t>contact / MEMS mic</w:t>
-            </w:r>
-          </w:p>
-        </w:tc>
-        <w:tc>
-          <w:tcPr>
-            <w:tcW w:type="dxa" w:w="1080"/>
-          </w:tcPr>
-          <w:p>
-            <w:pPr>
-              <w:spacing w:after="20" w:before="20"/>
-            </w:pPr>
-            <w:r>
-              <w:rPr>
-                <w:sz w:val="17"/>
-              </w:rPr>
-              <w:t>I²S</w:t>
-            </w:r>
-          </w:p>
-        </w:tc>
+      </w:tr>
+      <w:tr>
         <w:tc>
           <w:tcPr>
             <w:tcW w:type="dxa" w:w="1656"/>
@@ -633,15 +414,13 @@
               <w:rPr>
                 <w:sz w:val="17"/>
               </w:rPr>
-              <w:t>always-on</w:t>
+              <w:t>Optional module</w:t>
             </w:r>
           </w:p>
         </w:tc>
-      </w:tr>
-      <w:tr>
         <w:tc>
           <w:tcPr>
-            <w:tcW w:type="dxa" w:w="1512"/>
+            <w:tcW w:type="dxa" w:w="4320"/>
           </w:tcPr>
           <w:p>
             <w:pPr>
@@ -651,13 +430,13 @@
               <w:rPr>
                 <w:sz w:val="17"/>
               </w:rPr>
-              <w:t>Capnography</w:t>
+              <w:t>Portable ultrasound — AI-GUIDED, not AI-diagnosed</w:t>
             </w:r>
           </w:p>
         </w:tc>
         <w:tc>
           <w:tcPr>
-            <w:tcW w:type="dxa" w:w="2952"/>
+            <w:tcW w:type="dxa" w:w="3744"/>
           </w:tcPr>
           <w:p>
             <w:pPr>
@@ -667,42 +446,12 @@
               <w:rPr>
                 <w:sz w:val="17"/>
               </w:rPr>
-              <w:t>airway</w:t>
+              <w:t>most-requested add-on; assists image capture</w:t>
             </w:r>
           </w:p>
         </w:tc>
-        <w:tc>
-          <w:tcPr>
-            <w:tcW w:type="dxa" w:w="2952"/>
-          </w:tcPr>
-          <w:p>
-            <w:pPr>
-              <w:spacing w:after="20" w:before="20"/>
-            </w:pPr>
-            <w:r>
-              <w:rPr>
-                <w:sz w:val="17"/>
-              </w:rPr>
-              <w:t>NDIR CO₂ module + cannula + pump</w:t>
-            </w:r>
-          </w:p>
-        </w:tc>
-        <w:tc>
-          <w:tcPr>
-            <w:tcW w:type="dxa" w:w="1080"/>
-          </w:tcPr>
-          <w:p>
-            <w:pPr>
-              <w:spacing w:after="20" w:before="20"/>
-            </w:pPr>
-            <w:r>
-              <w:rPr>
-                <w:sz w:val="17"/>
-              </w:rPr>
-              <w:t>UART</w:t>
-            </w:r>
-          </w:p>
-        </w:tc>
+      </w:tr>
+      <w:tr>
         <w:tc>
           <w:tcPr>
             <w:tcW w:type="dxa" w:w="1656"/>
@@ -715,7 +464,39 @@
               <w:rPr>
                 <w:sz w:val="17"/>
               </w:rPr>
-              <w:t>wake-on-demand</w:t>
+              <w:t>Optional module</w:t>
+            </w:r>
+          </w:p>
+        </w:tc>
+        <w:tc>
+          <w:tcPr>
+            <w:tcW w:type="dxa" w:w="4320"/>
+          </w:tcPr>
+          <w:p>
+            <w:pPr>
+              <w:spacing w:after="20" w:before="20"/>
+            </w:pPr>
+            <w:r>
+              <w:rPr>
+                <w:sz w:val="17"/>
+              </w:rPr>
+              <w:t>Thermal imaging</w:t>
+            </w:r>
+          </w:p>
+        </w:tc>
+        <w:tc>
+          <w:tcPr>
+            <w:tcW w:type="dxa" w:w="3744"/>
+          </w:tcPr>
+          <w:p>
+            <w:pPr>
+              <w:spacing w:after="20" w:before="20"/>
+            </w:pPr>
+            <w:r>
+              <w:rPr>
+                <w:sz w:val="17"/>
+              </w:rPr>
+              <w:t>value is when FUSED with PPG/BP/ECG for perfusion/shock, not standalone</w:t>
             </w:r>
           </w:p>
         </w:tc>
@@ -731,7 +512,7 @@
           <w:color w:val="5A5A5A"/>
           <w:sz w:val="17"/>
         </w:rPr>
-        <w:t>Akida is a digital core with no analog front-end: every sensor is digital-output and bridged to Akida by the host MCU, which also runs the signal preprocessing. A discrete-Akida board uses the AKD1000 (FCBGA package); the sub-milliwatt Akida Pico is licensable IP, not a solderable chip. See docs/hardware_bom.md.</w:t>
+        <w:t>Thermal is optional because it reads skin (not core) temperature, is hard to interpret, and few EMS protocols use it today; its real value is fused perfusion/shock estimation. Blood analyzers and EEG are niche, optional at most.</w:t>
       </w:r>
     </w:p>
     <w:p>
@@ -744,7 +525,7 @@
           <w:color w:val="2E5A88"/>
           <w:sz w:val="26"/>
         </w:rPr>
-        <w:t>5. Market position</w:t>
+        <w:t>4. Why on-device (neuromorphic) AI</w:t>
       </w:r>
     </w:p>
     <w:p>
@@ -752,21 +533,7 @@
         <w:jc w:val="both"/>
       </w:pPr>
       <w:r>
-        <w:t>Point-of-care testing in austere settings is active but fragmented — ultrasound (Butterfly), labs (i-STAT-class), and vitals monitors are separate powered boxes. No one ships an integrated, offline, low-power unit that runs many tests together and ties them to stabilization. That integration, at a battery-realistic power budget, is the whitespace.</w:t>
-      </w:r>
-    </w:p>
-    <w:p>
-      <w:pPr>
-        <w:jc w:val="both"/>
-      </w:pPr>
-      <w:r>
-        <w:rPr>
-          <w:b/>
-        </w:rPr>
-        <w:t xml:space="preserve">Buy the silicon. </w:t>
-      </w:r>
-      <w:r>
-        <w:t>BrainChip supplies the processor, and its Akida family spans an always-on sub-milliwatt core (Akida Pico) up through larger event-based parts with on-chip learning and vision — so one vendor and one toolchain cover the entire MARCH roadmap. BrainChip raised $25M in Dec 2025 targeting medical/wearables. The contribution is the offline multimodal system, not a new chip — where a processing-in-memory / architecture background is the advantage.</w:t>
+        <w:t>Continuous multimodal fusion, event and trend detection, and documentation all run on the device — offline, low power, no cloud. That matters in transport (no reliable network), for patient privacy, and for latency. A neuromorphic core (BrainChip Akida) is what makes always-on multimodal AI feasible inside a monitor's power and thermal budget. Models are trained off-device, quantized to the chip's integer arithmetic, and verified on the Akida simulator before any hardware is bought — a chip-agnostic pipeline already validated end to end.</w:t>
       </w:r>
     </w:p>
     <w:p>
@@ -779,7 +546,7 @@
           <w:color w:val="2E5A88"/>
           <w:sz w:val="26"/>
         </w:rPr>
-        <w:t>6. Regulatory</w:t>
+        <w:t>5. What's proven</w:t>
       </w:r>
     </w:p>
     <w:p>
@@ -787,7 +554,47 @@
         <w:jc w:val="both"/>
       </w:pPr>
       <w:r>
-        <w:t>Position as a diagnostic-support tool with the clinician in control, keeping it out of the highest-risk lane. Each diagnostic function can carry its own clearance, and 97% of AI devices clear via 510(k) predicate (FDA eased decision-support rules Jan 2026). This is why capability is phased: ship a defensible test cluster first, add modules against their own predicates.</w:t>
+        <w:t>The on-device interpretation models that make the monitor smart already learn on real clinical data and deploy on the committed chip with almost no accuracy loss (5-seed measurements, public datasets):</w:t>
+      </w:r>
+    </w:p>
+    <w:p>
+      <w:pPr>
+        <w:pStyle w:val="ListBullet"/>
+      </w:pPr>
+      <w:r>
+        <w:t>ECG arrhythmia (MIT-BIH): AUROC 0.970, float→on-chip agreement 0.98.</w:t>
+      </w:r>
+    </w:p>
+    <w:p>
+      <w:pPr>
+        <w:pStyle w:val="ListBullet"/>
+      </w:pPr>
+      <w:r>
+        <w:t>Heart sounds (CinC 2016): AUROC 0.945, agreement 0.95.</w:t>
+      </w:r>
+    </w:p>
+    <w:p>
+      <w:pPr>
+        <w:pStyle w:val="ListBullet"/>
+      </w:pPr>
+      <w:r>
+        <w:t>ECG myocardial infarction (PTB-XL): AUROC 0.890, agreement 0.92.</w:t>
+      </w:r>
+    </w:p>
+    <w:p>
+      <w:pPr>
+        <w:pStyle w:val="ListBullet"/>
+      </w:pPr>
+      <w:r>
+        <w:t>Occult hemorrhage / compensatory reserve: demonstrated in physiologically-grounded simulation (real induced-hypovolemia data requested; not yet a clinical accuracy claim).</w:t>
+      </w:r>
+    </w:p>
+    <w:p>
+      <w:pPr>
+        <w:jc w:val="both"/>
+      </w:pPr>
+      <w:r>
+        <w:t>Each result is leakage-safe, multi-seed, and reported with per-class recall. On-chip numbers are from BrainChip's Akida simulator (not a published bit-exact-to-silicon claim).</w:t>
       </w:r>
     </w:p>
     <w:p>
@@ -800,23 +607,15 @@
           <w:color w:val="2E5A88"/>
           <w:sz w:val="26"/>
         </w:rPr>
-        <w:t>7. Go-to-market</w:t>
+        <w:t>6. The differentiator (moat)</w:t>
       </w:r>
     </w:p>
     <w:p>
       <w:pPr>
-        <w:pStyle w:val="ListBullet"/>
+        <w:jc w:val="both"/>
       </w:pPr>
       <w:r>
-        <w:t>Primary — disaster &amp; far-forward: USAR, humanitarian and military medics, rural clinicians. DARPA (MASH, Triage Challenge) and TATRC's Autonomous Casualty Care are a non-dilutive on-ramp and early buyer.</w:t>
-      </w:r>
-    </w:p>
-    <w:p>
-      <w:pPr>
-        <w:pStyle w:val="ListBullet"/>
-      </w:pPr>
-      <w:r>
-        <w:t>Secondary — ICU/transport: value during power loss or transport, but incumbents are entrenched and cycles are long. Expansion, not wedge.</w:t>
+        <w:t>Not a new sensor — every modality is a commodity handheld already. The moat is integration plus the clinical record: on-device multimodal fusion feeding an automatic, trend-aware clinical timeline and a structured hospital handoff, inside a monitor that preserves EMS workflow. Competitors own single modalities; none own the unified, self-documenting record.</w:t>
       </w:r>
     </w:p>
     <w:p>
@@ -829,15 +628,39 @@
           <w:color w:val="2E5A88"/>
           <w:sz w:val="26"/>
         </w:rPr>
-        <w:t>8. Moat</w:t>
+        <w:t>7. Why it doesn't exist yet</w:t>
       </w:r>
     </w:p>
     <w:p>
       <w:pPr>
-        <w:jc w:val="both"/>
+        <w:pStyle w:val="ListBullet"/>
       </w:pPr>
       <w:r>
-        <w:t>Not the silicon (vendors sell it) or any single test (point solutions own each). The moat is the integration: an offline, milliwatt-scale core fusing many diagnostics, validated early-diagnosis signatures like PPG Compensatory Reserve that catch hemorrhage before vitals move, and an event-driven memory/compute design suited to a PIM background — wrapped in the MARCH stabilization loop. Sharpened: the defensible core is the autonomous fusion layer that turns several instrumented signals into the specific diagnoses — shock etiology, occult hemorrhage, tension pneumothorax — that neither a competitor's single-function device nor an unaided responder can produce at the point of injury. Individual tests are commodities; the multi-signal synthesis is not.</w:t>
+        <w:t>Regulation: every added sensor adds clearance burden — the core-plus-modules design contains it.</w:t>
+      </w:r>
+    </w:p>
+    <w:p>
+      <w:pPr>
+        <w:pStyle w:val="ListBullet"/>
+      </w:pPr>
+      <w:r>
+        <w:t>Engineering: combining ECG, ultrasound, PPG, thermal, and audio into one reliable battery device is hard.</w:t>
+      </w:r>
+    </w:p>
+    <w:p>
+      <w:pPr>
+        <w:pStyle w:val="ListBullet"/>
+      </w:pPr>
+      <w:r>
+        <w:t>Market structure: different companies dominate different modalities; none integrate.</w:t>
+      </w:r>
+    </w:p>
+    <w:p>
+      <w:pPr>
+        <w:pStyle w:val="ListBullet"/>
+      </w:pPr>
+      <w:r>
+        <w:t>Workflow: EMS crews won't adopt another device — so we replace the monitor they already use, not add one.</w:t>
       </w:r>
     </w:p>
     <w:p>
@@ -850,7 +673,7 @@
           <w:color w:val="2E5A88"/>
           <w:sz w:val="26"/>
         </w:rPr>
-        <w:t>9. v1 scope</w:t>
+        <w:t>8. Market &amp; go-to-market</w:t>
       </w:r>
     </w:p>
     <w:p>
@@ -858,47 +681,7 @@
         <w:jc w:val="both"/>
       </w:pPr>
       <w:r>
-        <w:t>Keep breadth as the north star; ship the MARCH-critical on-core cluster first — the tests that catch the preventable killers with no consumables:</w:t>
-      </w:r>
-    </w:p>
-    <w:p>
-      <w:pPr>
-        <w:pStyle w:val="ListBullet"/>
-      </w:pPr>
-      <w:r>
-        <w:t>Hemorrhage: PPG Compensatory Reserve + perfusion + shock index.</w:t>
-      </w:r>
-    </w:p>
-    <w:p>
-      <w:pPr>
-        <w:pStyle w:val="ListBullet"/>
-      </w:pPr>
-      <w:r>
-        <w:t>Airway / respiration: breath-sound + stridor analysis + capnography + SpO₂.</w:t>
-      </w:r>
-    </w:p>
-    <w:p>
-      <w:pPr>
-        <w:pStyle w:val="ListBullet"/>
-      </w:pPr>
-      <w:r>
-        <w:t>Circulation: ECG + heart-sound analysis.</w:t>
-      </w:r>
-    </w:p>
-    <w:p>
-      <w:pPr>
-        <w:pStyle w:val="ListBullet"/>
-      </w:pPr>
-      <w:r>
-        <w:t>Hypothermia / head: thermal + basic EEG/neuro signs.</w:t>
-      </w:r>
-    </w:p>
-    <w:p>
-      <w:pPr>
-        <w:jc w:val="both"/>
-      </w:pPr>
-      <w:r>
-        <w:t>Design the sensor bus so an ultrasound probe and a POC-lab module dock later against their own clearances.</w:t>
+        <w:t>Primary: civilian EMS / ambulance services — the monitor is a device every crew already carries and must eventually replace, so adoption needs no new workflow. Adjacent: far-forward, military, and disaster medicine, where the offline, low-power, rugged story is strongest and DARPA (MASH, Triage Challenge) and TATRC offer a non-dilutive on-ramp.</w:t>
       </w:r>
     </w:p>
     <w:p>
@@ -911,7 +694,7 @@
           <w:color w:val="2E5A88"/>
           <w:sz w:val="26"/>
         </w:rPr>
-        <w:t>10. Where development stands</w:t>
+        <w:t>9. Regulatory</w:t>
       </w:r>
     </w:p>
     <w:p>
@@ -919,95 +702,7 @@
         <w:jc w:val="both"/>
       </w:pPr>
       <w:r>
-        <w:rPr>
-          <w:b/>
-        </w:rPr>
-        <w:t xml:space="preserve">What is proven. </w:t>
-      </w:r>
-      <w:r>
-        <w:t>The full deploy pipeline works end to end and is verified before any silicon is bought: a model is trained off-device, quantized to the chip's integer arithmetic, and run on BrainChip's Akida simulator. Three modalities learn on real clinical data and deploy on-chip with almost no accuracy loss — ECG arrhythmia (float AUROC 0.970, on-chip agreement 0.98), heart sounds (0.945, 0.95), and myocardial infarction (0.890, 0.92) — each a 5-seed measurement on a public dataset (MIT-BIH, CinC 2016, PTB-XL). Engineering discipline is deliberate: results labelled real vs. synthetic, leakage-safe splits (by patient/case), and multi-seed metrics with per-class recall — the rigor that has repeatedly caught masked failures.</w:t>
-      </w:r>
-    </w:p>
-    <w:p>
-      <w:pPr>
-        <w:jc w:val="both"/>
-      </w:pPr>
-      <w:r>
-        <w:rPr>
-          <w:b/>
-        </w:rPr>
-        <w:t xml:space="preserve">What is in progress. </w:t>
-      </w:r>
-      <w:r>
-        <w:t>The flagship differentiated capability — occult hemorrhage from the PPG waveform (Compensatory Reserve) — is demonstrated end-to-end on a physiologically-grounded synthetic generator whose label is time-aligned to each moment's reserve, detecting compromise before heart rate moves (float AUROC 0.975). It is honestly synthetic: it proves the pipeline and that the signal is learnable, not clinical accuracy; real induced-hypovolemia (LBNP) data has been requested. The next component is the multi-signal fusion layer that combines several instrumented signals into diagnoses no single sensor or physical exam can produce (shock etiology, tension pneumothorax). Lung sounds (Respiration) are spec'd; an early EEG (Head) attempt was retired after coming back at chance.</w:t>
-      </w:r>
-    </w:p>
-    <w:p>
-      <w:pPr>
-        <w:jc w:val="both"/>
-      </w:pPr>
-      <w:r>
-        <w:rPr>
-          <w:b/>
-        </w:rPr>
-        <w:t xml:space="preserve">The engineering frontier — energy. </w:t>
-      </w:r>
-      <w:r>
-        <w:t>The on-chip fidelity gap the earlier spiking path (Xylo) exposed is largely resolved on the committed Akida target: across all three real modalities the float model's accuracy survives quantization essentially intact (agreement 0.92–0.98), because a feed-forward quantized CNN avoids the temporal state-rounding that hurt the spiking net. The remaining open measurement is energy — the milliwatt claim rests on BrainChip's published always-on specs and an analytical model; a measured figure on the Akida-CNN path is the next validation.</w:t>
-      </w:r>
-    </w:p>
-    <w:p>
-      <w:pPr>
-        <w:jc w:val="both"/>
-      </w:pPr>
-      <w:r>
-        <w:rPr>
-          <w:b/>
-        </w:rPr>
-        <w:t xml:space="preserve">Honest caveats. </w:t>
-      </w:r>
-      <w:r>
-        <w:t>The on-chip numbers are from BrainChip's software simulator (no published bit-exact-to-silicon claim) and target Akida 2.0, not the sub-mW Akida Pico committed for the always-on cluster. The models are quantized CNNs, not spiking nets — a chip-and-architecture result, not chip alone. Hemorrhage/CRM is synthetic, not a clinical accuracy claim. And these are single-signal detectors; the multi-signal fusion layer is the next build.</w:t>
-      </w:r>
-    </w:p>
-    <w:p>
-      <w:pPr>
-        <w:jc w:val="both"/>
-      </w:pPr>
-      <w:r>
-        <w:t>Phased roadmap:</w:t>
-      </w:r>
-    </w:p>
-    <w:p>
-      <w:pPr>
-        <w:pStyle w:val="ListBullet"/>
-      </w:pPr>
-      <w:r>
-        <w:t>Phase 0 — software proof (done): the neuromorphic deploy pipeline is verified on the Akida simulator; three real-data modalities learn and deploy on the committed chip; the flagship hemorrhage capability is demonstrated in simulation.</w:t>
-      </w:r>
-    </w:p>
-    <w:p>
-      <w:pPr>
-        <w:pStyle w:val="ListBullet"/>
-      </w:pPr>
-      <w:r>
-        <w:t>Phase 1 — MVP hardening (now → ~1 month): the multi-signal fusion layer, a measured energy figure on the Akida path, and real induced-hypovolemia data plus a fourth modality (lung sounds).</w:t>
-      </w:r>
-    </w:p>
-    <w:p>
-      <w:pPr>
-        <w:pStyle w:val="ListBullet"/>
-      </w:pPr>
-      <w:r>
-        <w:t>Phase 2 — FPGA prototype: implement the core; measure real power/latency on noisy field-like data.</w:t>
-      </w:r>
-    </w:p>
-    <w:p>
-      <w:pPr>
-        <w:pStyle w:val="ListBullet"/>
-      </w:pPr>
-      <w:r>
-        <w:t>Phase 3 — silicon + clinical validation: after the cluster is proven and a pilot is secured.</w:t>
+        <w:t>Position as passive decision-support with the clinician in control — observations and trends, not diagnoses — which keeps it out of the highest-risk lane. The core monitor and each module carry their own clearances, and 97% of AI devices clear via a 510(k) predicate. Modular design contains the regulatory burden per capability.</w:t>
       </w:r>
     </w:p>
     <w:p>
@@ -1020,7 +715,7 @@
           <w:color w:val="2E5A88"/>
           <w:sz w:val="26"/>
         </w:rPr>
-        <w:t>11. Near-term plan: investable in a week, MVP in a month</w:t>
+        <w:t>10. Where it stands &amp; the ask</w:t>
       </w:r>
     </w:p>
     <w:p>
@@ -1028,55 +723,7 @@
         <w:jc w:val="both"/>
       </w:pPr>
       <w:r>
-        <w:rPr>
-          <w:b/>
-        </w:rPr>
-        <w:t xml:space="preserve">Where we are. </w:t>
-      </w:r>
-      <w:r>
-        <w:t>A pre-seed concept with a working software proof — three real clinical modalities learning and deploying on the committed chip, the flagship hemorrhage capability demonstrated in simulation, and a clear, honest picture of what is proven and what is next. That is enough to raise on and enough to build a demonstrable MVP quickly, because the hard integration work already exists.</w:t>
-      </w:r>
-    </w:p>
-    <w:p>
-      <w:pPr>
-        <w:jc w:val="both"/>
-      </w:pPr>
-      <w:r>
-        <w:rPr>
-          <w:b/>
-        </w:rPr>
-        <w:t xml:space="preserve">Investable in a week. </w:t>
-      </w:r>
-      <w:r>
-        <w:t>The pitch stands on what is already true: a real market whitespace (no one ships an integrated, offline, low-power multi-test unit tied to stabilization); a capital-efficient buy-the-silicon strategy (Innatera/BrainChip supply the processor); a working end-to-end pipeline that de-risks hardware before spend; a real clinical modality (ECG) learning on real data with the milliwatt energy advantage quantified; and a non-dilutive on-ramp through DARPA (MASH, Triage Challenge) and TATRC. Week-one deliverables: a pitch deck and this brief, plus a two-minute live demo of the ECG spiking pipeline running on the bit-exact Xylo simulator with its energy comparison against a conventional network.</w:t>
-      </w:r>
-    </w:p>
-    <w:p>
-      <w:pPr>
-        <w:jc w:val="both"/>
-      </w:pPr>
-      <w:r>
-        <w:rPr>
-          <w:b/>
-        </w:rPr>
-        <w:t xml:space="preserve">MVP in a month. </w:t>
-      </w:r>
-      <w:r>
-        <w:t>The MVP is a demonstrable offline multi-modal neuromorphic diagnostic — in simulation, the correct de-risking stage before FPGA. Concretely: (1) harden the ECG model's on-chip fidelity so the deployed integer model matches the trained one; (2) land a solid second modality — EEG seizure if the current diagnostic clears the front-end, otherwise the synthetic Compensatory-Reserve hemorrhage proxy that best mirrors the target physiology; (3) run both co-resident on one simulated neuromorphic core (bit-exact vehicle today: XyloSim; production target: Akida), producing a live MARCH read and a total energy budget. Packaged as a one-command, repeatable demo plus a short technical validation report. The MVP is honest about its stage — it proves the system and the energy thesis in bit-exact simulation, exactly the evidence that justifies building the first FPGA prototype.</w:t>
-      </w:r>
-    </w:p>
-    <w:p>
-      <w:pPr>
-        <w:jc w:val="both"/>
-      </w:pPr>
-      <w:r>
-        <w:rPr>
-          <w:b/>
-        </w:rPr>
-        <w:t xml:space="preserve">The ask. </w:t>
-      </w:r>
-      <w:r>
-        <w:t>Framed for the raise: fund the hardware step (FPGA plus Xylo/Akida development kits), a clinical-data access effort (gated induced-hypovolemia / LBNP hemorrhage data), and the engineering time to carry the MARCH on-core cluster from validated simulation to a field-testable prototype.</w:t>
+        <w:t>Software and Akida-simulator validation are done across three real modalities; the project is at hardware bring-up on an off-the-shelf Akida board, with the sensor-acquisition and fusion/timeline software in parallel. Next: the multimodal fusion + clinical-timeline layer, a measured on-device energy figure, and the core-monitor prototype. The raise funds hardware (Akida dev hardware, sensors), clinical-data access, and the engineering to carry a validated pipeline into a field-ready core monitor.</w:t>
       </w:r>
     </w:p>
     <w:p>
@@ -1094,12 +741,7 @@
     </w:p>
     <w:p>
       <w:r>
-        <w:t>Preventable prehospital death &amp; MARCH · MARCH algorithm · POC testing in disaster/critical care · POC ultrasound in austere environments</w:t>
-      </w:r>
-    </w:p>
-    <w:p>
-      <w:r>
-        <w:t>CRM wearable validation · CRM vs. traditional vitals · DARPA MASH · BrainChip $25M · FDA AI/SaMD pathway</w:t>
+        <w:t>Preventable prehospital death &amp; MARCH  ·  POC testing in austere care  ·  digital-stethoscope &amp; PPG CRM validation  ·  DARPA MASH  ·  BrainChip Akida  ·  FDA AI/SaMD pathway</w:t>
       </w:r>
     </w:p>
     <w:sectPr>

</xml_diff>